<commit_message>
Update corresponding authors and cover letter
</commit_message>
<xml_diff>
--- a/paper/cover_letter.docx
+++ b/paper/cover_letter.docx
@@ -38,7 +38,7 @@
     </w:p>
     <w:p>
       <w:r>
-        <w:t>The work is based on the authors' B.Sc. thesis at the Islamic University of Technology, and its source repository is public. The manuscript has not been published elsewhere and is not under consideration by another journal. All authors have approved the manuscript and agree with its submission. The code, data and the tables behind every reported number are archived at https://doi.org/10.5281/zenodo.23479562. The corresponding author is a co-author of a public dataset mentioned, but not used for any result, in the manuscript; this is stated in the declaration of competing interest.</w:t>
+        <w:t>The work is based on the authors' B.Sc. thesis at the Islamic University of Technology, and its source repository is public. The manuscript has not been published elsewhere and is not under consideration by another journal. All authors have approved the manuscript and agree with its submission. The code, data and the tables behind every reported number are archived at https://doi.org/10.5281/zenodo.23479562. One of the authors (M. T. Kawser) is a co-author of a public dataset mentioned, but not used for any result, in the manuscript; this is stated in the declaration of competing interest.</w:t>
       </w:r>
     </w:p>
     <w:p>
@@ -51,16 +51,16 @@
         <w:t>Sincerely,</w:t>
         <w:br/>
         <w:br/>
-        <w:t>Mohammad Tawhid Kawser (corresponding author)</w:t>
+        <w:t>Saadman Sakib (corresponding author)</w:t>
         <w:br/>
-        <w:t>Professor, Department of Electrical and Electronic Engineering</w:t>
+        <w:t>Department of Electrical and Electronic Engineering</w:t>
         <w:br/>
         <w:t>Islamic University of Technology (IUT), Board Bazar, Gazipur 1704, Bangladesh</w:t>
         <w:br/>
-        <w:t>kawser@iut-dhaka.edu</w:t>
+        <w:t>saadmansakib21@iut-dhaka.edu</w:t>
         <w:br/>
         <w:br/>
-        <w:t>on behalf of Saadman Sakib, Adhnan Kalim and Evan Ashfaque</w:t>
+        <w:t>on behalf of Adhnan Kalim, Evan Ashfaque and Mohammad Tawhid Kawser</w:t>
       </w:r>
     </w:p>
     <w:sectPr>

</xml_diff>

<commit_message>
Update manuscript for EAAI technical screening compliance (acronym-free title/keywords, defined abstract acronyms, AI application tags)
</commit_message>
<xml_diff>
--- a/paper/cover_letter.docx
+++ b/paper/cover_letter.docx
@@ -3,268 +3,62 @@
 <w:document xmlns:wpc="http://schemas.microsoft.com/office/word/2010/wordprocessingCanvas" xmlns:cx="http://schemas.microsoft.com/office/drawing/2014/chartex" xmlns:cx1="http://schemas.microsoft.com/office/drawing/2015/9/8/chartex" xmlns:mc="http://schemas.openxmlformats.org/markup-compatibility/2006" xmlns:o="urn:schemas-microsoft-com:office:office" xmlns:r="http://schemas.openxmlformats.org/officeDocument/2006/relationships" xmlns:m="http://schemas.openxmlformats.org/officeDocument/2006/math" xmlns:v="urn:schemas-microsoft-com:vml" xmlns:wp14="http://schemas.microsoft.com/office/word/2010/wordprocessingDrawing" xmlns:wp="http://schemas.openxmlformats.org/drawingml/2006/wordprocessingDrawing" xmlns:w10="urn:schemas-microsoft-com:office:word" xmlns:w="http://schemas.openxmlformats.org/wordprocessingml/2006/main" xmlns:w14="http://schemas.microsoft.com/office/word/2010/wordml" xmlns:w15="http://schemas.microsoft.com/office/word/2012/wordml" xmlns:w16se="http://schemas.microsoft.com/office/word/2015/wordml/symex" xmlns:wpg="http://schemas.microsoft.com/office/word/2010/wordprocessingGroup" xmlns:wpi="http://schemas.microsoft.com/office/word/2010/wordprocessingInk" xmlns:wne="http://schemas.microsoft.com/office/word/2006/wordml" xmlns:wps="http://schemas.microsoft.com/office/word/2010/wordprocessingShape" mc:Ignorable="w14 w15 w16se wp14">
   <w:body>
     <w:p>
-      <w:pPr>
-        <w:spacing w:after="120"/>
-      </w:pPr>
       <w:r>
-        <w:rPr>
-          <w:rFonts w:ascii="Times New Roman" w:hAnsi="Times New Roman"/>
-          <w:sz w:val="22"/>
-        </w:rPr>
-        <w:t>21 October 2026</w:t>
+        <w:t>24 October 2026</w:t>
       </w:r>
-      <w:r>
-        <w:rPr>
-          <w:rFonts w:ascii="Times New Roman" w:hAnsi="Times New Roman"/>
-          <w:sz w:val="22"/>
-          <w:vertAlign w:val="superscript"/>
-        </w:rPr>
-      </w:r>
-      <w:r>
-        <w:rPr>
-          <w:rFonts w:ascii="Times New Roman" w:hAnsi="Times New Roman"/>
-          <w:sz w:val="22"/>
-        </w:rPr>
-      </w:r>
-      <w:bookmarkStart w:id="0" w:name="_GoBack"/>
-      <w:bookmarkEnd w:id="0"/>
     </w:p>
     <w:p>
-      <w:pPr>
-        <w:spacing w:after="120"/>
-      </w:pPr>
       <w:r>
-        <w:rPr>
-          <w:rFonts w:ascii="Times New Roman" w:hAnsi="Times New Roman"/>
-          <w:sz w:val="22"/>
-        </w:rPr>
         <w:t>The Editor-in-Chief</w:t>
-      </w:r>
-      <w:r>
-        <w:rPr>
-          <w:rFonts w:ascii="Times New Roman" w:hAnsi="Times New Roman"/>
-          <w:sz w:val="22"/>
-        </w:rPr>
         <w:br/>
-        <w:t>Computer Communications</w:t>
-      </w:r>
-      <w:r>
-        <w:rPr>
-          <w:rFonts w:ascii="Times New Roman" w:hAnsi="Times New Roman"/>
-          <w:sz w:val="22"/>
-        </w:rPr>
+        <w:t>Engineering Applications of Artificial Intelligence</w:t>
         <w:br/>
         <w:t>Elsevier</w:t>
       </w:r>
     </w:p>
     <w:p>
-      <w:pPr>
-        <w:spacing w:after="120"/>
-      </w:pPr>
       <w:r>
-        <w:rPr>
-          <w:rFonts w:ascii="Times New Roman" w:hAnsi="Times New Roman"/>
-          <w:sz w:val="22"/>
-        </w:rPr>
         <w:t>Dear Editor,</w:t>
       </w:r>
     </w:p>
     <w:p>
-      <w:pPr>
-        <w:spacing w:after="120"/>
-        <w:jc w:val="both"/>
-      </w:pPr>
       <w:r>
-        <w:rPr>
-          <w:rFonts w:ascii="Times New Roman" w:hAnsi="Times New Roman"/>
-          <w:sz w:val="22"/>
-        </w:rPr>
-        <w:t xml:space="preserve">We submit the manuscript "Timestamp-Alignment Leakage in Drive-Test Handover Prediction: Quantification, Mitigation, and Blind Second-Operator Validation" for consideration as an </w:t>
-      </w:r>
-      <w:r>
-        <w:rPr>
-          <w:rFonts w:ascii="Times New Roman" w:hAnsi="Times New Roman"/>
-          <w:sz w:val="22"/>
-        </w:rPr>
-        <w:t>original research article in Computer Communications.</w:t>
+        <w:t>We submit the manuscript "Timestamp-Alignment Leakage in Drive-Test Handover Prediction: Quantification, Mitigation, and Blind Second-Operator Validation" for consideration as an original research article in Engineering Applications of Artificial Intelligence.</w:t>
       </w:r>
     </w:p>
     <w:p>
-      <w:pPr>
-        <w:spacing w:after="120"/>
-        <w:jc w:val="both"/>
-      </w:pPr>
       <w:r>
-        <w:rPr>
-          <w:rFonts w:ascii="Times New Roman" w:hAnsi="Times New Roman"/>
-          <w:sz w:val="22"/>
-        </w:rPr>
-        <w:t xml:space="preserve">Learned handover predictors are increasingly trained on the one-hertz tabular exports of commercial drive-test tools. The manuscript shows that a property of such exports, rather than of the network or </w:t>
-      </w:r>
-      <w:r>
-        <w:rPr>
-          <w:rFonts w:ascii="Times New Roman" w:hAnsi="Times New Roman"/>
-          <w:sz w:val="22"/>
-        </w:rPr>
-        <w:t xml:space="preserve">the learner, can produce most of the reported predictive skill. In four campaigns on a commercial LTE network, the export row stamped just before a handover command already carries the post-handover serving cell in 76% of handovers. Ignoring this inflates </w:t>
-      </w:r>
-      <w:r>
-        <w:rPr>
-          <w:rFonts w:ascii="Times New Roman" w:hAnsi="Times New Roman"/>
-          <w:sz w:val="22"/>
-        </w:rPr>
-        <w:t>one-second AUPRC about four-fold, and the inflation comes mainly from serving-cell radio measurements rather than from cell identifiers. We support the mechanism with a native-rate public corpus from three further operators, and we replicate the main findi</w:t>
-      </w:r>
-      <w:r>
-        <w:rPr>
-          <w:rFonts w:ascii="Times New Roman" w:hAnsi="Times New Roman"/>
-          <w:sz w:val="22"/>
-        </w:rPr>
-        <w:t>ngs on a capture from a second operator recorded after the pipeline was frozen. We also show that the splitting protocol changes which learner appears best. The manuscript closes with a short audit and a reporting checklist that apply to any predictor buil</w:t>
-      </w:r>
-      <w:r>
-        <w:rPr>
-          <w:rFonts w:ascii="Times New Roman" w:hAnsi="Times New Roman"/>
-          <w:sz w:val="22"/>
-        </w:rPr>
-        <w:t>t on aggregated measurement exports.</w:t>
+        <w:t>Machine learning and artificial intelligence predictors are increasingly trained on the one-hertz tabular exports of commercial drive-test tools for mission-critical telemetry and cellular network operations. The manuscript shows that an unexamined property of such exports, rather than of the network or the learning algorithm, can produce most of the reported predictive skill. In four campaigns on a commercial LTE network, the export row stamped just before a handover command already carries the post-handover serving cell in 76% of handovers. Ignoring this temporal alignment defect inflates one-second Area Under the Precision-Recall Curve (AUPRC) about four-fold, and the inflation comes mainly from serving-cell radio measurements rather than from cell identifiers. We support the mechanism with a native-rate public corpus from three further operators, and we replicate the main findings on a capture from a second operator recorded after the pipeline was frozen. We also show that the splitting protocol changes which learner appears best. The manuscript closes with a short audit and a reporting checklist that apply to any machine-learning predictor built on aggregated measurement exports.</w:t>
       </w:r>
     </w:p>
     <w:p>
-      <w:pPr>
-        <w:spacing w:after="120"/>
-        <w:jc w:val="both"/>
-      </w:pPr>
       <w:r>
-        <w:rPr>
-          <w:rFonts w:ascii="Times New Roman" w:hAnsi="Times New Roman"/>
-          <w:sz w:val="22"/>
-        </w:rPr>
-        <w:t>We believe the work fits the journal's scope on the evaluation of protocols and services in operational mobile networks, and that it will be of practical use to researchers who build or review learned mobility-managemen</w:t>
-      </w:r>
-      <w:r>
-        <w:rPr>
-          <w:rFonts w:ascii="Times New Roman" w:hAnsi="Times New Roman"/>
-          <w:sz w:val="22"/>
-        </w:rPr>
-        <w:t>t methods.</w:t>
+        <w:t>We believe the work fits the journal's scope on engineering applications of artificial intelligence, real-world data-driven methodologies, and trustworthy machine-learning deployment in mission-critical infrastructure.</w:t>
       </w:r>
     </w:p>
     <w:p>
-      <w:pPr>
-        <w:spacing w:after="120"/>
-        <w:jc w:val="both"/>
-      </w:pPr>
       <w:r>
-        <w:rPr>
-          <w:rFonts w:ascii="Times New Roman" w:hAnsi="Times New Roman"/>
-          <w:sz w:val="22"/>
-        </w:rPr>
-        <w:t>The work is based on the authors' B.Sc. thesis at the Islamic University of Technology, and its source repository is public. The manuscript has not been published elsewhere and is not under consideration by another journal. All authors have appr</w:t>
-      </w:r>
-      <w:r>
-        <w:rPr>
-          <w:rFonts w:ascii="Times New Roman" w:hAnsi="Times New Roman"/>
-          <w:sz w:val="22"/>
-        </w:rPr>
-        <w:t>oved the manuscript and agree with its submission. The code, data and the tables behind every reported number are archived at https://doi.org/10.5281/zenodo.23479562. One of the authors (M. T. Kawser) is a co-author of a public dataset mentioned, but not u</w:t>
-      </w:r>
-      <w:r>
-        <w:rPr>
-          <w:rFonts w:ascii="Times New Roman" w:hAnsi="Times New Roman"/>
-          <w:sz w:val="22"/>
-        </w:rPr>
-        <w:t>sed for any result, in the manuscript; this is stated in the declaration of competing interest.</w:t>
+        <w:t>The work is based on the authors' B.Sc. thesis at the Islamic University of Technology, and its source repository is public. The manuscript has not been published elsewhere and is not under consideration by another journal. All authors have approved the manuscript and agree with its submission. The code, data and the tables behind every reported number are archived at https://doi.org/10.5281/zenodo.23479562. One of the authors (M. T. Kawser) is a co-author of a public dataset mentioned, but not used for any result, in the manuscript; this is stated in the declaration of competing interest.</w:t>
       </w:r>
     </w:p>
     <w:p>
-      <w:pPr>
-        <w:spacing w:after="120"/>
-      </w:pPr>
       <w:r>
-        <w:rPr>
-          <w:rFonts w:ascii="Times New Roman" w:hAnsi="Times New Roman"/>
-          <w:sz w:val="22"/>
-        </w:rPr>
         <w:t>Thank you for considering our manuscript.</w:t>
       </w:r>
     </w:p>
     <w:p>
-      <w:pPr>
-        <w:spacing w:after="120"/>
-      </w:pPr>
       <w:r>
-        <w:rPr>
-          <w:rFonts w:ascii="Times New Roman" w:hAnsi="Times New Roman"/>
-          <w:sz w:val="22"/>
-        </w:rPr>
         <w:t>Sincerely,</w:t>
-      </w:r>
-      <w:r>
-        <w:rPr>
-          <w:rFonts w:ascii="Times New Roman" w:hAnsi="Times New Roman"/>
-          <w:sz w:val="22"/>
-        </w:rPr>
         <w:br/>
-      </w:r>
-      <w:r>
-        <w:rPr>
-          <w:rFonts w:ascii="Times New Roman" w:hAnsi="Times New Roman"/>
-          <w:sz w:val="22"/>
-        </w:rPr>
         <w:br/>
         <w:t>Saadman Sakib (corresponding author)</w:t>
-      </w:r>
-      <w:r>
-        <w:rPr>
-          <w:rFonts w:ascii="Times New Roman" w:hAnsi="Times New Roman"/>
-          <w:sz w:val="22"/>
-        </w:rPr>
         <w:br/>
         <w:t>Department of Electrical and Electronic Engineering</w:t>
-      </w:r>
-      <w:r>
-        <w:rPr>
-          <w:rFonts w:ascii="Times New Roman" w:hAnsi="Times New Roman"/>
-          <w:sz w:val="22"/>
-        </w:rPr>
         <w:br/>
-      </w:r>
-      <w:r>
-        <w:rPr>
-          <w:rFonts w:ascii="Times New Roman" w:hAnsi="Times New Roman"/>
-          <w:sz w:val="22"/>
-        </w:rPr>
-        <w:lastRenderedPageBreak/>
-        <w:t>Islamic Universit</w:t>
-      </w:r>
-      <w:r>
-        <w:rPr>
-          <w:rFonts w:ascii="Times New Roman" w:hAnsi="Times New Roman"/>
-          <w:sz w:val="22"/>
-        </w:rPr>
-        <w:t>y of Technology (IUT), Board Bazar, Gazipur 1704, Bangladesh</w:t>
-      </w:r>
-      <w:r>
-        <w:rPr>
-          <w:rFonts w:ascii="Times New Roman" w:hAnsi="Times New Roman"/>
-          <w:sz w:val="22"/>
-        </w:rPr>
+        <w:t>Islamic University of Technology (IUT), Board Bazar, Gazipur 1704, Bangladesh</w:t>
         <w:br/>
         <w:t>saadmansakib21@iut-dhaka.edu</w:t>
-      </w:r>
-      <w:r>
-        <w:rPr>
-          <w:rFonts w:ascii="Times New Roman" w:hAnsi="Times New Roman"/>
-          <w:sz w:val="22"/>
-        </w:rPr>
         <w:br/>
-      </w:r>
-      <w:r>
-        <w:rPr>
-          <w:rFonts w:ascii="Times New Roman" w:hAnsi="Times New Roman"/>
-          <w:sz w:val="22"/>
-        </w:rPr>
         <w:br/>
         <w:t>on behalf of Adhnan Kalim, Evan Ashfaque and Mohammad Tawhid Kawser</w:t>
       </w:r>

</xml_diff>